<commit_message>
docs: Add flowcharts to project documents
9 flowchart PNG images generated in docs/img/:
  fc_architecture.png    - System Architecture Flow (SDD)
  fc_double_buffer.png   - Double-Buffer State Machine (SDD)
  fc_ball_physics.png    - Ball Physics Update logic (SDD)
  fc_active_mux.png      - Active Level Mux decision tree (SDD)
  fc_bram_write.png      - BRAM Write Protocol (ICD)
  fc_buf_handshake.png   - Double-Buffer Handshake (ICD)
  fc_change_control.png  - Change Control Process (CM)
  fc_test_execution.png  - Test Execution Process (STP)
  fc_dev_phases.png      - Development Phase Flow (SDP)

Flowcharts embedded in: ICD, SDD, SDP, CM, STP

https://claude.ai/code/session_017hYU7zmWoUoe7kPyUjvHZ6
</commit_message>
<xml_diff>
--- a/docs/CM_Configuration_Management_Plan.docx
+++ b/docs/CM_Configuration_Management_Plan.docx
@@ -862,6 +862,59 @@
         <w:t>4  Change Control Process</w:t>
       </w:r>
     </w:p>
+    <w:p>
+      <w:pPr>
+        <w:jc w:val="center"/>
+      </w:pPr>
+      <w:r>
+        <w:drawing>
+          <wp:inline xmlns:a="http://schemas.openxmlformats.org/drawingml/2006/main" xmlns:pic="http://schemas.openxmlformats.org/drawingml/2006/picture">
+            <wp:extent cx="4114800" cy="8628676"/>
+            <wp:docPr id="1" name="Picture 1"/>
+            <wp:cNvGraphicFramePr>
+              <a:graphicFrameLocks noChangeAspect="1"/>
+            </wp:cNvGraphicFramePr>
+            <a:graphic>
+              <a:graphicData uri="http://schemas.openxmlformats.org/drawingml/2006/picture">
+                <pic:pic>
+                  <pic:nvPicPr>
+                    <pic:cNvPr id="0" name="fc_change_control.png"/>
+                    <pic:cNvPicPr/>
+                  </pic:nvPicPr>
+                  <pic:blipFill>
+                    <a:blip r:embed="rId9"/>
+                    <a:stretch>
+                      <a:fillRect/>
+                    </a:stretch>
+                  </pic:blipFill>
+                  <pic:spPr>
+                    <a:xfrm>
+                      <a:off x="0" y="0"/>
+                      <a:ext cx="4114800" cy="8628676"/>
+                    </a:xfrm>
+                    <a:prstGeom prst="rect"/>
+                  </pic:spPr>
+                </pic:pic>
+              </a:graphicData>
+            </a:graphic>
+          </wp:inline>
+        </w:drawing>
+      </w:r>
+    </w:p>
+    <w:p>
+      <w:pPr>
+        <w:jc w:val="center"/>
+      </w:pPr>
+      <w:r>
+        <w:rPr>
+          <w:i/>
+          <w:color w:val="606060"/>
+          <w:sz w:val="17"/>
+        </w:rPr>
+        <w:t>Figure: Change Control Process</w:t>
+      </w:r>
+    </w:p>
+    <w:p/>
     <w:tbl>
       <w:tblPr>
         <w:tblStyle w:val="TableGrid"/>

</xml_diff>